<commit_message>
Add deployment notes + live URL; regenerate Word doc
Site is live at https://chicoboy700.github.io/Oyez-Arguments/. Adds BUILD_LOG
Entry 9 (deployment), live URL in README/DEPLOY, and a "Going live" section
in HOW_I_BUILT_THIS.docx.

Co-Authored-By: Claude Opus 4.8 <noreply@anthropic.com>
</commit_message>
<xml_diff>
--- a/HOW_I_BUILT_THIS.docx
+++ b/HOW_I_BUILT_THIS.docx
@@ -91,7 +91,7 @@
         </w:rPr>
         <w:t xml:space="preserve">Audio &amp; data courtesy of </w:t>
       </w:r>
-      <w:hyperlink w:history="1" r:id="rId-p4mhpjlt4bas_kwlj_o7">
+      <w:hyperlink w:history="1" r:id="rIdzdugi7qlxwnpyneuq4ysd">
         <w:r>
           <w:rPr>
             <w:rStyle w:val="Hyperlink"/>
@@ -173,7 +173,7 @@
       <w:pPr>
         <w:spacing w:after="140"/>
       </w:pPr>
-      <w:hyperlink w:history="1" r:id="rIdqxlvg8f9z90ydzkyszfzt">
+      <w:hyperlink w:history="1" r:id="rIdjmgprawia2lmijrseslal">
         <w:r>
           <w:rPr>
             <w:rStyle w:val="Hyperlink"/>
@@ -846,6 +846,75 @@
       <w:r>
         <w:t xml:space="preserve">Oyez is credited on every screen, and the whole thing is for personal, non-commercial use, honoring Oyez’s license.</w:t>
       </w:r>
+    </w:p>
+    <w:p>
+      <w:pPr>
+        <w:pStyle w:val="Heading1"/>
+      </w:pPr>
+      <w:r>
+        <w:t xml:space="preserve">Going live</w:t>
+      </w:r>
+    </w:p>
+    <w:p>
+      <w:pPr>
+        <w:spacing w:after="140"/>
+      </w:pPr>
+      <w:r>
+        <w:t xml:space="preserve">The last step was putting it on the real internet. One guardrail came first: the project had been built inside a folder that also held unrelated personal files, so rather than publish that, I assembled a clean, separate copy containing </w:t>
+      </w:r>
+      <w:r>
+        <w:rPr>
+          <w:i/>
+          <w:iCs/>
+        </w:rPr>
+        <w:t xml:space="preserve">only</w:t>
+      </w:r>
+      <w:r>
+        <w:t xml:space="preserve"> the project and published that — nothing private went out. Then I uploaded it to a free GitHub repository and switched on GitHub's free website hosting (Pages). About a minute later it was live.</w:t>
+      </w:r>
+    </w:p>
+    <w:p>
+      <w:pPr>
+        <w:spacing w:after="140"/>
+      </w:pPr>
+      <w:r>
+        <w:t xml:space="preserve">Crucially, I then tested the </w:t>
+      </w:r>
+      <w:r>
+        <w:rPr>
+          <w:i/>
+          <w:iCs/>
+        </w:rPr>
+        <w:t xml:space="preserve">live</w:t>
+      </w:r>
+      <w:r>
+        <w:t xml:space="preserve"> site, not just the local copy: opened a recent high-profile case, pressed play and watched it stream the full two-hour-plus recording, and searched a lawyer's name to confirm the whole 7,566-person index loaded over the network. “Works on my machine” isn’t “works” — hosting can differ in small ways, so the real URL is the only real test.</w:t>
+      </w:r>
+    </w:p>
+    <w:p>
+      <w:pPr>
+        <w:pBdr>
+          <w:left w:val="single" w:color="9a6a00" w:sz="18" w:space="10"/>
+        </w:pBdr>
+        <w:spacing w:after="160" w:before="60"/>
+        <w:ind w:left="180"/>
+      </w:pPr>
+      <w:r>
+        <w:rPr>
+          <w:b/>
+          <w:bCs/>
+          <w:color w:val="9a6a00"/>
+        </w:rPr>
+        <w:t xml:space="preserve">Live at:  </w:t>
+      </w:r>
+      <w:hyperlink w:history="1" r:id="rId366c-unruis5jzk3uvzxo">
+        <w:r>
+          <w:rPr>
+            <w:rStyle w:val="Hyperlink"/>
+          </w:rPr>
+          <w:t xml:space="preserve">chicoboy700.github.io/Oyez-Arguments</w:t>
+        </w:r>
+      </w:hyperlink>
     </w:p>
     <w:p>
       <w:pPr>

</xml_diff>

<commit_message>
Update live URL after account rename
Co-Authored-By: Claude Opus 4.8 <noreply@anthropic.com>
</commit_message>
<xml_diff>
--- a/HOW_I_BUILT_THIS.docx
+++ b/HOW_I_BUILT_THIS.docx
@@ -91,7 +91,7 @@
         </w:rPr>
         <w:t xml:space="preserve">Audio &amp; data courtesy of </w:t>
       </w:r>
-      <w:hyperlink w:history="1" r:id="rIdzdugi7qlxwnpyneuq4ysd">
+      <w:hyperlink w:history="1" r:id="rId_odedixefu1txw9odl8kv">
         <w:r>
           <w:rPr>
             <w:rStyle w:val="Hyperlink"/>
@@ -173,7 +173,7 @@
       <w:pPr>
         <w:spacing w:after="140"/>
       </w:pPr>
-      <w:hyperlink w:history="1" r:id="rIdjmgprawia2lmijrseslal">
+      <w:hyperlink w:history="1" r:id="rId-fxal6jfccljks3dp7yf6">
         <w:r>
           <w:rPr>
             <w:rStyle w:val="Hyperlink"/>
@@ -907,12 +907,12 @@
         </w:rPr>
         <w:t xml:space="preserve">Live at:  </w:t>
       </w:r>
-      <w:hyperlink w:history="1" r:id="rId366c-unruis5jzk3uvzxo">
+      <w:hyperlink w:history="1" r:id="rIdgh0mtrncen4sm3ztryycm">
         <w:r>
           <w:rPr>
             <w:rStyle w:val="Hyperlink"/>
           </w:rPr>
-          <w:t xml:space="preserve">chicoboy700.github.io/Oyez-Arguments</w:t>
+          <w:t xml:space="preserve">anon5303210.github.io/Oyez-Arguments</w:t>
         </w:r>
       </w:hyperlink>
     </w:p>

</xml_diff>